<commit_message>
AI concierge scope: one doc with the LumiLink vs in-house PACKS comparison
Co-Authored-By: Claude Opus 5.5 <noreply@anthropic.com>
</commit_message>
<xml_diff>
--- a/docs/LumiLink-AI-Concierge-Scope.docx
+++ b/docs/LumiLink-AI-Concierge-Scope.docx
@@ -48,7 +48,7 @@
           <w:color w:val="3A3A3A"/>
           <w:sz w:val="21"/>
         </w:rPr>
-        <w:t>A virtual budtender or sales associate that sees, speaks and answers in any language</w:t>
+        <w:t>A virtual budtender that speaks, answers and recommends in any language</w:t>
       </w:r>
     </w:p>
     <w:p>
@@ -64,7 +64,7 @@
           <w:color w:val="5A5A5A"/>
           <w:sz w:val="17"/>
         </w:rPr>
-        <w:t>Scope Brief, Draft 1  ·  October 15, 2026</w:t>
+        <w:t>Scope Brief, Draft 2  ·  October 15, 2026</w:t>
       </w:r>
     </w:p>
     <w:p>
@@ -162,7 +162,7 @@
                 <w:color w:val="111111"/>
                 <w:sz w:val="17"/>
               </w:rPr>
-              <w:t>A website avatar like the reel's virtual budtender: trained on the store, guardrailed, with a set personality and a custom look. LumiLink product first, PACKS second.</w:t>
+              <w:t>A website avatar like the reel's virtual budtender: trained on the store, guardrailed, with a set personality and a custom look.</w:t>
             </w:r>
           </w:p>
         </w:tc>
@@ -223,7 +223,7 @@
                 <w:color w:val="111111"/>
                 <w:sz w:val="17"/>
               </w:rPr>
-              <w:t>A new add-on: our existing ElevenLabs agent (brain, voice, 30+ languages, knowledge base, product lookup) with a licensed avatar face streamed on the site.</w:t>
+              <w:t>A LumiLink add-on: our existing ElevenLabs agent (voice, 30+ languages, knowledge base, product lookup) with a licensed avatar face streamed on the site.</w:t>
             </w:r>
           </w:p>
         </w:tc>
@@ -282,7 +282,7 @@
                 <w:color w:val="111111"/>
                 <w:sz w:val="17"/>
               </w:rPr>
-              <w:t>38-54 hours for the LumiLink product, 8-14 more for PACKS; about 2 weeks. Ceiling: 98-142 hours.</w:t>
+              <w:t>38-54 hours for the LumiLink add-on, then 8-14 to launch it for PACKS; about 2 weeks.</w:t>
             </w:r>
           </w:p>
         </w:tc>
@@ -463,7 +463,7 @@
                 <w:color w:val="111111"/>
                 <w:sz w:val="17"/>
               </w:rPr>
-              <w:t>Build it as a website add-on on the current stack. Pilot it on PACKS before selling it.</w:t>
+              <w:t>Build it under LumiLink and launch PACKS as the first client, not as a separate in-house build.</w:t>
             </w:r>
           </w:p>
         </w:tc>
@@ -529,8 +529,8 @@
         </w:tblBorders>
       </w:tblPr>
       <w:tblGrid>
-        <w:gridCol w:w="7660"/>
-        <w:gridCol w:w="2419"/>
+        <w:gridCol w:w="7459"/>
+        <w:gridCol w:w="2620"/>
       </w:tblGrid>
       <w:tr>
         <w:trPr>
@@ -539,7 +539,7 @@
         </w:trPr>
         <w:tc>
           <w:tcPr>
-            <w:tcW w:type="dxa" w:w="7660"/>
+            <w:tcW w:type="dxa" w:w="7459"/>
             <w:shd w:val="clear" w:color="auto" w:fill="111111"/>
             <w:tcMar>
               <w:top w:type="dxa" w:w="90"/>
@@ -569,7 +569,7 @@
         </w:tc>
         <w:tc>
           <w:tcPr>
-            <w:tcW w:type="dxa" w:w="2419"/>
+            <w:tcW w:type="dxa" w:w="2620"/>
             <w:shd w:val="clear" w:color="auto" w:fill="111111"/>
             <w:tcMar>
               <w:top w:type="dxa" w:w="90"/>
@@ -604,7 +604,7 @@
         </w:trPr>
         <w:tc>
           <w:tcPr>
-            <w:tcW w:type="dxa" w:w="7660"/>
+            <w:tcW w:type="dxa" w:w="7459"/>
             <w:tcMar>
               <w:top w:type="dxa" w:w="90"/>
               <w:left w:type="dxa" w:w="110"/>
@@ -632,7 +632,7 @@
         </w:tc>
         <w:tc>
           <w:tcPr>
-            <w:tcW w:type="dxa" w:w="2419"/>
+            <w:tcW w:type="dxa" w:w="2620"/>
             <w:tcMar>
               <w:top w:type="dxa" w:w="90"/>
               <w:left w:type="dxa" w:w="110"/>
@@ -665,7 +665,7 @@
         </w:trPr>
         <w:tc>
           <w:tcPr>
-            <w:tcW w:type="dxa" w:w="7660"/>
+            <w:tcW w:type="dxa" w:w="7459"/>
             <w:shd w:val="clear" w:color="auto" w:fill="F2F2F2"/>
             <w:tcMar>
               <w:top w:type="dxa" w:w="90"/>
@@ -694,7 +694,7 @@
         </w:tc>
         <w:tc>
           <w:tcPr>
-            <w:tcW w:type="dxa" w:w="2419"/>
+            <w:tcW w:type="dxa" w:w="2620"/>
             <w:shd w:val="clear" w:color="auto" w:fill="F2F2F2"/>
             <w:tcMar>
               <w:top w:type="dxa" w:w="90"/>
@@ -728,7 +728,7 @@
         </w:trPr>
         <w:tc>
           <w:tcPr>
-            <w:tcW w:type="dxa" w:w="7660"/>
+            <w:tcW w:type="dxa" w:w="7459"/>
             <w:tcMar>
               <w:top w:type="dxa" w:w="90"/>
               <w:left w:type="dxa" w:w="110"/>
@@ -756,7 +756,7 @@
         </w:tc>
         <w:tc>
           <w:tcPr>
-            <w:tcW w:type="dxa" w:w="2419"/>
+            <w:tcW w:type="dxa" w:w="2620"/>
             <w:tcMar>
               <w:top w:type="dxa" w:w="90"/>
               <w:left w:type="dxa" w:w="110"/>
@@ -789,7 +789,7 @@
         </w:trPr>
         <w:tc>
           <w:tcPr>
-            <w:tcW w:type="dxa" w:w="7660"/>
+            <w:tcW w:type="dxa" w:w="7459"/>
             <w:shd w:val="clear" w:color="auto" w:fill="F2F2F2"/>
             <w:tcMar>
               <w:top w:type="dxa" w:w="90"/>
@@ -818,7 +818,7 @@
         </w:tc>
         <w:tc>
           <w:tcPr>
-            <w:tcW w:type="dxa" w:w="2419"/>
+            <w:tcW w:type="dxa" w:w="2620"/>
             <w:shd w:val="clear" w:color="auto" w:fill="F2F2F2"/>
             <w:tcMar>
               <w:top w:type="dxa" w:w="90"/>
@@ -852,7 +852,7 @@
         </w:trPr>
         <w:tc>
           <w:tcPr>
-            <w:tcW w:type="dxa" w:w="7660"/>
+            <w:tcW w:type="dxa" w:w="7459"/>
             <w:tcMar>
               <w:top w:type="dxa" w:w="90"/>
               <w:left w:type="dxa" w:w="110"/>
@@ -874,13 +874,13 @@
                 <w:color w:val="111111"/>
                 <w:sz w:val="17"/>
               </w:rPr>
-              <w:t>Store knowledge: reuse knowledge base and product lookup, add a product-recommendation tool</w:t>
+              <w:t>Store knowledge: reuse knowledge base and product lookup, add a recommendation tool</w:t>
             </w:r>
           </w:p>
         </w:tc>
         <w:tc>
           <w:tcPr>
-            <w:tcW w:type="dxa" w:w="2419"/>
+            <w:tcW w:type="dxa" w:w="2620"/>
             <w:tcMar>
               <w:top w:type="dxa" w:w="90"/>
               <w:left w:type="dxa" w:w="110"/>
@@ -913,7 +913,7 @@
         </w:trPr>
         <w:tc>
           <w:tcPr>
-            <w:tcW w:type="dxa" w:w="7660"/>
+            <w:tcW w:type="dxa" w:w="7459"/>
             <w:shd w:val="clear" w:color="auto" w:fill="F2F2F2"/>
             <w:tcMar>
               <w:top w:type="dxa" w:w="90"/>
@@ -942,7 +942,7 @@
         </w:tc>
         <w:tc>
           <w:tcPr>
-            <w:tcW w:type="dxa" w:w="2419"/>
+            <w:tcW w:type="dxa" w:w="2620"/>
             <w:shd w:val="clear" w:color="auto" w:fill="F2F2F2"/>
             <w:tcMar>
               <w:top w:type="dxa" w:w="90"/>
@@ -976,7 +976,7 @@
         </w:trPr>
         <w:tc>
           <w:tcPr>
-            <w:tcW w:type="dxa" w:w="7660"/>
+            <w:tcW w:type="dxa" w:w="7459"/>
             <w:tcMar>
               <w:top w:type="dxa" w:w="90"/>
               <w:left w:type="dxa" w:w="110"/>
@@ -998,13 +998,13 @@
                 <w:color w:val="111111"/>
                 <w:sz w:val="17"/>
               </w:rPr>
-              <w:t>Dashboard: avatar and persona settings, kill switch, transcripts, minute limits</w:t>
+              <w:t>Dashboard: avatar and persona settings, kill switch, transcripts, minute caps</w:t>
             </w:r>
           </w:p>
         </w:tc>
         <w:tc>
           <w:tcPr>
-            <w:tcW w:type="dxa" w:w="2419"/>
+            <w:tcW w:type="dxa" w:w="2620"/>
             <w:tcMar>
               <w:top w:type="dxa" w:w="90"/>
               <w:left w:type="dxa" w:w="110"/>
@@ -1037,7 +1037,7 @@
         </w:trPr>
         <w:tc>
           <w:tcPr>
-            <w:tcW w:type="dxa" w:w="7660"/>
+            <w:tcW w:type="dxa" w:w="7459"/>
             <w:shd w:val="clear" w:color="auto" w:fill="F2F2F2"/>
             <w:tcMar>
               <w:top w:type="dxa" w:w="90"/>
@@ -1066,7 +1066,7 @@
         </w:tc>
         <w:tc>
           <w:tcPr>
-            <w:tcW w:type="dxa" w:w="2419"/>
+            <w:tcW w:type="dxa" w:w="2620"/>
             <w:shd w:val="clear" w:color="auto" w:fill="F2F2F2"/>
             <w:tcMar>
               <w:top w:type="dxa" w:w="90"/>
@@ -1100,7 +1100,7 @@
         </w:trPr>
         <w:tc>
           <w:tcPr>
-            <w:tcW w:type="dxa" w:w="7660"/>
+            <w:tcW w:type="dxa" w:w="7459"/>
             <w:tcMar>
               <w:top w:type="dxa" w:w="90"/>
               <w:left w:type="dxa" w:w="110"/>
@@ -1128,7 +1128,7 @@
         </w:tc>
         <w:tc>
           <w:tcPr>
-            <w:tcW w:type="dxa" w:w="2419"/>
+            <w:tcW w:type="dxa" w:w="2620"/>
             <w:tcMar>
               <w:top w:type="dxa" w:w="90"/>
               <w:left w:type="dxa" w:w="110"/>
@@ -1161,131 +1161,7 @@
         </w:trPr>
         <w:tc>
           <w:tcPr>
-            <w:tcW w:type="dxa" w:w="7660"/>
-            <w:shd w:val="clear" w:color="auto" w:fill="F2F2F2"/>
-            <w:tcMar>
-              <w:top w:type="dxa" w:w="90"/>
-              <w:left w:type="dxa" w:w="110"/>
-              <w:bottom w:type="dxa" w:w="90"/>
-              <w:right w:type="dxa" w:w="110"/>
-            </w:tcMar>
-          </w:tcPr>
-          <w:p>
-            <w:pPr>
-              <w:keepNext/>
-              <w:spacing w:before="20" w:after="20"/>
-              <w:spacing w:line="264" w:lineRule="auto"/>
-            </w:pPr>
-            <w:r>
-              <w:rPr>
-                <w:rFonts w:ascii="Arial" w:hAnsi="Arial" w:eastAsia="Arial"/>
-                <w:b w:val="0"/>
-                <w:caps w:val="0"/>
-                <w:color w:val="111111"/>
-                <w:sz w:val="17"/>
-              </w:rPr>
-              <w:t>LumiLink product subtotal</w:t>
-            </w:r>
-          </w:p>
-        </w:tc>
-        <w:tc>
-          <w:tcPr>
-            <w:tcW w:type="dxa" w:w="2419"/>
-            <w:shd w:val="clear" w:color="auto" w:fill="F2F2F2"/>
-            <w:tcMar>
-              <w:top w:type="dxa" w:w="90"/>
-              <w:left w:type="dxa" w:w="110"/>
-              <w:bottom w:type="dxa" w:w="90"/>
-              <w:right w:type="dxa" w:w="110"/>
-            </w:tcMar>
-          </w:tcPr>
-          <w:p>
-            <w:pPr>
-              <w:keepNext/>
-              <w:spacing w:before="20" w:after="20"/>
-              <w:spacing w:line="264" w:lineRule="auto"/>
-            </w:pPr>
-            <w:r>
-              <w:rPr>
-                <w:rFonts w:ascii="Arial" w:hAnsi="Arial" w:eastAsia="Arial"/>
-                <w:b w:val="0"/>
-                <w:caps w:val="0"/>
-                <w:color w:val="111111"/>
-                <w:sz w:val="17"/>
-              </w:rPr>
-              <w:t>38-54</w:t>
-            </w:r>
-          </w:p>
-        </w:tc>
-      </w:tr>
-      <w:tr>
-        <w:trPr>
-          <w:cantSplit w:val="true"/>
-        </w:trPr>
-        <w:tc>
-          <w:tcPr>
-            <w:tcW w:type="dxa" w:w="7660"/>
-            <w:tcMar>
-              <w:top w:type="dxa" w:w="90"/>
-              <w:left w:type="dxa" w:w="110"/>
-              <w:bottom w:type="dxa" w:w="90"/>
-              <w:right w:type="dxa" w:w="110"/>
-            </w:tcMar>
-          </w:tcPr>
-          <w:p>
-            <w:pPr>
-              <w:keepNext/>
-              <w:spacing w:before="20" w:after="20"/>
-              <w:spacing w:line="264" w:lineRule="auto"/>
-            </w:pPr>
-            <w:r>
-              <w:rPr>
-                <w:rFonts w:ascii="Arial" w:hAnsi="Arial" w:eastAsia="Arial"/>
-                <w:b w:val="0"/>
-                <w:caps w:val="0"/>
-                <w:color w:val="111111"/>
-                <w:sz w:val="17"/>
-              </w:rPr>
-              <w:t>PACKS deployment: budtender persona, cannabis guardrails, menu data feed, branded avatar</w:t>
-            </w:r>
-          </w:p>
-        </w:tc>
-        <w:tc>
-          <w:tcPr>
-            <w:tcW w:type="dxa" w:w="2419"/>
-            <w:tcMar>
-              <w:top w:type="dxa" w:w="90"/>
-              <w:left w:type="dxa" w:w="110"/>
-              <w:bottom w:type="dxa" w:w="90"/>
-              <w:right w:type="dxa" w:w="110"/>
-            </w:tcMar>
-          </w:tcPr>
-          <w:p>
-            <w:pPr>
-              <w:keepNext/>
-              <w:spacing w:before="20" w:after="20"/>
-              <w:spacing w:line="264" w:lineRule="auto"/>
-            </w:pPr>
-            <w:r>
-              <w:rPr>
-                <w:rFonts w:ascii="Arial" w:hAnsi="Arial" w:eastAsia="Arial"/>
-                <w:b w:val="0"/>
-                <w:caps w:val="0"/>
-                <w:color w:val="111111"/>
-                <w:sz w:val="17"/>
-              </w:rPr>
-              <w:t>8-14</w:t>
-            </w:r>
-          </w:p>
-        </w:tc>
-      </w:tr>
-      <w:tr>
-        <w:trPr>
-          <w:cantSplit w:val="true"/>
-        </w:trPr>
-        <w:tc>
-          <w:tcPr>
-            <w:tcW w:type="dxa" w:w="7660"/>
+            <w:tcW w:type="dxa" w:w="7459"/>
             <w:shd w:val="clear" w:color="auto" w:fill="F2F2F2"/>
             <w:tcMar>
               <w:top w:type="dxa" w:w="90"/>
@@ -1307,13 +1183,13 @@
                 <w:color w:val="111111"/>
                 <w:sz w:val="17"/>
               </w:rPr>
-              <w:t>TOTAL</w:t>
+              <w:t>TOTAL, LumiLink add-on</w:t>
             </w:r>
           </w:p>
         </w:tc>
         <w:tc>
           <w:tcPr>
-            <w:tcW w:type="dxa" w:w="2419"/>
+            <w:tcW w:type="dxa" w:w="2620"/>
             <w:shd w:val="clear" w:color="auto" w:fill="F2F2F2"/>
             <w:tcMar>
               <w:top w:type="dxa" w:w="90"/>
@@ -1335,7 +1211,7 @@
                 <w:color w:val="111111"/>
                 <w:sz w:val="17"/>
               </w:rPr>
-              <w:t>46-68 (excludes vendor wait and legal review)</w:t>
+              <w:t>38-54 (excludes vendor wait and legal review)</w:t>
             </w:r>
           </w:p>
         </w:tc>
@@ -1370,7 +1246,7 @@
           <w:color w:val="111111"/>
           <w:sz w:val="19"/>
         </w:rPr>
-        <w:t>SEO was scoped at 173-210 hours and its code shipped in about a week; Outbound's first three phases took one day.</w:t>
+        <w:t>SEO was scoped at 173-210 hours and its code shipped in a week; Outbound's first three phases took one day.</w:t>
       </w:r>
     </w:p>
     <w:p>
@@ -1397,34 +1273,7 @@
           <w:color w:val="111111"/>
           <w:sz w:val="19"/>
         </w:rPr>
-        <w:t>the original estimate was 82-118 hours plus 16-24 for PACKS; budget against that if the mobile embed slips.</w:t>
-      </w:r>
-    </w:p>
-    <w:p>
-      <w:pPr>
-        <w:pStyle w:val="ListBullet"/>
-        <w:spacing w:before="40" w:after="40"/>
-        <w:spacing w:line="264" w:lineRule="auto"/>
-      </w:pPr>
-      <w:r>
-        <w:rPr>
-          <w:rFonts w:ascii="Arial" w:hAnsi="Arial" w:eastAsia="Arial"/>
-          <w:b/>
-          <w:caps w:val="0"/>
-          <w:color w:val="111111"/>
-          <w:sz w:val="19"/>
-        </w:rPr>
-        <w:t xml:space="preserve">Calendar: </w:t>
-      </w:r>
-      <w:r>
-        <w:rPr>
-          <w:rFonts w:ascii="Arial" w:hAnsi="Arial" w:eastAsia="Arial"/>
-          <w:b w:val="0"/>
-          <w:caps w:val="0"/>
-          <w:color w:val="111111"/>
-          <w:sz w:val="19"/>
-        </w:rPr>
-        <w:t>about 2 weeks, with a stock-avatar demo in 2-3 days. Custom-avatar delivery sets the launch date.</w:t>
+        <w:t>the original estimate was 82-118 hours; budget against it if the mobile embed slips.</w:t>
       </w:r>
     </w:p>
     <w:p>
@@ -1593,7 +1442,7 @@
                 <w:color w:val="111111"/>
                 <w:sz w:val="17"/>
               </w:rPr>
-              <w:t>ElevenLabs agent minutes (current plan rate)</w:t>
+              <w:t>ElevenLabs agent minutes plus LLM tokens</w:t>
             </w:r>
           </w:p>
         </w:tc>
@@ -1649,7 +1498,7 @@
                 <w:color w:val="111111"/>
                 <w:sz w:val="17"/>
               </w:rPr>
-              <w:t>$0.08/min</w:t>
+              <w:t>$0.085-0.125/min</w:t>
             </w:r>
           </w:p>
         </w:tc>
@@ -1683,7 +1532,7 @@
                 <w:color w:val="111111"/>
                 <w:sz w:val="17"/>
               </w:rPr>
-              <w:t>LLM tokens</w:t>
+              <w:t>Avatar streaming (face only)</w:t>
             </w:r>
           </w:p>
         </w:tc>
@@ -1741,7 +1590,7 @@
                 <w:color w:val="111111"/>
                 <w:sz w:val="17"/>
               </w:rPr>
-              <w:t>$0.005-0.045/min</w:t>
+              <w:t>$0.09-0.18/min</w:t>
             </w:r>
           </w:p>
         </w:tc>
@@ -1774,7 +1623,7 @@
                 <w:color w:val="111111"/>
                 <w:sz w:val="17"/>
               </w:rPr>
-              <w:t>Avatar streaming (face only)</w:t>
+              <w:t>Avatar vendor plan</w:t>
             </w:r>
           </w:p>
         </w:tc>
@@ -1802,7 +1651,7 @@
                 <w:color w:val="111111"/>
                 <w:sz w:val="17"/>
               </w:rPr>
-              <w:t>Variable</w:t>
+              <w:t>Recurring</w:t>
             </w:r>
           </w:p>
         </w:tc>
@@ -1830,7 +1679,7 @@
                 <w:color w:val="111111"/>
                 <w:sz w:val="17"/>
               </w:rPr>
-              <w:t>$0.09-0.18/min</w:t>
+              <w:t>About $99/month</w:t>
             </w:r>
           </w:p>
         </w:tc>
@@ -1864,7 +1713,7 @@
                 <w:color w:val="111111"/>
                 <w:sz w:val="17"/>
               </w:rPr>
-              <w:t>Avatar vendor plan</w:t>
+              <w:t>Custom avatar creation</w:t>
             </w:r>
           </w:p>
         </w:tc>
@@ -1893,7 +1742,7 @@
                 <w:color w:val="111111"/>
                 <w:sz w:val="17"/>
               </w:rPr>
-              <w:t>Recurring</w:t>
+              <w:t>One-time</w:t>
             </w:r>
           </w:p>
         </w:tc>
@@ -1901,95 +1750,6 @@
           <w:tcPr>
             <w:tcW w:type="dxa" w:w="3830"/>
             <w:shd w:val="clear" w:color="auto" w:fill="F2F2F2"/>
-            <w:tcMar>
-              <w:top w:type="dxa" w:w="90"/>
-              <w:left w:type="dxa" w:w="110"/>
-              <w:bottom w:type="dxa" w:w="90"/>
-              <w:right w:type="dxa" w:w="110"/>
-            </w:tcMar>
-          </w:tcPr>
-          <w:p>
-            <w:pPr>
-              <w:keepNext/>
-              <w:spacing w:before="20" w:after="20"/>
-              <w:spacing w:line="264" w:lineRule="auto"/>
-            </w:pPr>
-            <w:r>
-              <w:rPr>
-                <w:rFonts w:ascii="Arial" w:hAnsi="Arial" w:eastAsia="Arial"/>
-                <w:b w:val="0"/>
-                <w:caps w:val="0"/>
-                <w:color w:val="111111"/>
-                <w:sz w:val="17"/>
-              </w:rPr>
-              <w:t>About $99/month</w:t>
-            </w:r>
-          </w:p>
-        </w:tc>
-      </w:tr>
-      <w:tr>
-        <w:trPr>
-          <w:cantSplit w:val="true"/>
-        </w:trPr>
-        <w:tc>
-          <w:tcPr>
-            <w:tcW w:type="dxa" w:w="4536"/>
-            <w:tcMar>
-              <w:top w:type="dxa" w:w="90"/>
-              <w:left w:type="dxa" w:w="110"/>
-              <w:bottom w:type="dxa" w:w="90"/>
-              <w:right w:type="dxa" w:w="110"/>
-            </w:tcMar>
-          </w:tcPr>
-          <w:p>
-            <w:pPr>
-              <w:keepNext/>
-              <w:spacing w:before="20" w:after="20"/>
-              <w:spacing w:line="264" w:lineRule="auto"/>
-            </w:pPr>
-            <w:r>
-              <w:rPr>
-                <w:rFonts w:ascii="Arial" w:hAnsi="Arial" w:eastAsia="Arial"/>
-                <w:b w:val="0"/>
-                <w:caps w:val="0"/>
-                <w:color w:val="111111"/>
-                <w:sz w:val="17"/>
-              </w:rPr>
-              <w:t>Custom avatar creation</w:t>
-            </w:r>
-          </w:p>
-        </w:tc>
-        <w:tc>
-          <w:tcPr>
-            <w:tcW w:type="dxa" w:w="1713"/>
-            <w:tcMar>
-              <w:top w:type="dxa" w:w="90"/>
-              <w:left w:type="dxa" w:w="110"/>
-              <w:bottom w:type="dxa" w:w="90"/>
-              <w:right w:type="dxa" w:w="110"/>
-            </w:tcMar>
-          </w:tcPr>
-          <w:p>
-            <w:pPr>
-              <w:keepNext/>
-              <w:spacing w:before="20" w:after="20"/>
-              <w:spacing w:line="264" w:lineRule="auto"/>
-            </w:pPr>
-            <w:r>
-              <w:rPr>
-                <w:rFonts w:ascii="Arial" w:hAnsi="Arial" w:eastAsia="Arial"/>
-                <w:b w:val="0"/>
-                <w:caps w:val="0"/>
-                <w:color w:val="111111"/>
-                <w:sz w:val="17"/>
-              </w:rPr>
-              <w:t>One-time</w:t>
-            </w:r>
-          </w:p>
-        </w:tc>
-        <w:tc>
-          <w:tcPr>
-            <w:tcW w:type="dxa" w:w="3830"/>
             <w:tcMar>
               <w:top w:type="dxa" w:w="90"/>
               <w:left w:type="dxa" w:w="110"/>
@@ -2112,33 +1872,6 @@
     </w:p>
     <w:p>
       <w:pPr>
-        <w:pStyle w:val="ListBullet"/>
-        <w:spacing w:before="40" w:after="40"/>
-        <w:spacing w:line="264" w:lineRule="auto"/>
-      </w:pPr>
-      <w:r>
-        <w:rPr>
-          <w:rFonts w:ascii="Arial" w:hAnsi="Arial" w:eastAsia="Arial"/>
-          <w:b/>
-          <w:caps w:val="0"/>
-          <w:color w:val="111111"/>
-          <w:sz w:val="19"/>
-        </w:rPr>
-        <w:t xml:space="preserve">Not counted here: </w:t>
-      </w:r>
-      <w:r>
-        <w:rPr>
-          <w:rFonts w:ascii="Arial" w:hAnsi="Arial" w:eastAsia="Arial"/>
-          <w:b w:val="0"/>
-          <w:caps w:val="0"/>
-          <w:color w:val="111111"/>
-          <w:sz w:val="19"/>
-        </w:rPr>
-        <w:t>internal hours to set up each client's persona and knowledge, about 3-4 per client.</w:t>
-      </w:r>
-    </w:p>
-    <w:p>
-      <w:pPr>
         <w:spacing w:before="360" w:after="100"/>
         <w:keepNext/>
         <w:pBdr>
@@ -2181,7 +1914,7 @@
           <w:color w:val="111111"/>
           <w:sz w:val="19"/>
         </w:rPr>
-        <w:t>no medical or effect claims, 21+ gate before the avatar talks, no sales across state lines.</w:t>
+        <w:t>no medical or effect claims, a 21+ gate before the avatar talks, counsel review before launch.</w:t>
       </w:r>
     </w:p>
     <w:p>
@@ -2208,7 +1941,7 @@
           <w:color w:val="111111"/>
           <w:sz w:val="19"/>
         </w:rPr>
-        <w:t>customers will describe conditions; transcripts need retention limits and a privacy notice.</w:t>
+        <w:t>shoppers will describe conditions; transcripts need retention limits and a privacy notice.</w:t>
       </w:r>
     </w:p>
     <w:p>
@@ -2235,8 +1968,708 @@
           <w:color w:val="111111"/>
           <w:sz w:val="19"/>
         </w:rPr>
-        <w:t>video minutes cost about double voice; per-client minute caps ship on day one.</w:t>
+        <w:t>video costs about double voice per minute; per-client minute caps ship on day one.</w:t>
       </w:r>
+    </w:p>
+    <w:p>
+      <w:pPr>
+        <w:spacing w:before="360" w:after="100"/>
+        <w:keepNext/>
+        <w:pBdr>
+          <w:bottom w:val="single" w:color="111111" w:sz="12" w:space="6"/>
+        </w:pBdr>
+      </w:pPr>
+      <w:r>
+        <w:rPr>
+          <w:rFonts w:ascii="Arial" w:hAnsi="Arial" w:eastAsia="Arial"/>
+          <w:b/>
+          <w:caps/>
+          <w:color w:val="111111"/>
+          <w:sz w:val="24"/>
+          <w:spacing w:val="30"/>
+        </w:rPr>
+        <w:t>PACKS: On LumiLink or In-House</w:t>
+      </w:r>
+    </w:p>
+    <w:p>
+      <w:pPr>
+        <w:keepNext/>
+        <w:spacing w:before="0" w:after="100"/>
+        <w:spacing w:line="264" w:lineRule="auto"/>
+      </w:pPr>
+      <w:r>
+        <w:rPr>
+          <w:rFonts w:ascii="Arial" w:hAnsi="Arial" w:eastAsia="Arial"/>
+          <w:b w:val="0"/>
+          <w:caps w:val="0"/>
+          <w:color w:val="5A5A5A"/>
+          <w:sz w:val="17"/>
+        </w:rPr>
+        <w:t>The same budtender for PACKS, built two ways. Upkeep figures are our estimates.</w:t>
+      </w:r>
+    </w:p>
+    <w:tbl>
+      <w:tblPr>
+        <w:tblW w:type="auto" w:w="0"/>
+        <w:jc w:val="left"/>
+        <w:tblLayout w:type="fixed"/>
+        <w:tblLook w:firstColumn="1" w:firstRow="1" w:lastColumn="0" w:lastRow="0" w:noHBand="0" w:noVBand="1" w:val="04A0"/>
+        <w:tblLayout w:type="fixed"/>
+        <w:tblW w:type="dxa" w:w="10080"/>
+        <w:tblBorders>
+          <w:top w:val="single" w:color="BFBFBF" w:sz="6"/>
+          <w:bottom w:val="single" w:color="BFBFBF" w:sz="6"/>
+          <w:insideH w:val="single" w:color="BFBFBF" w:sz="4"/>
+          <w:left w:val="none" w:color="FFFFFF" w:sz="0"/>
+          <w:right w:val="none" w:color="FFFFFF" w:sz="0"/>
+          <w:insideV w:val="none" w:color="FFFFFF" w:sz="0"/>
+        </w:tblBorders>
+      </w:tblPr>
+      <w:tblGrid>
+        <w:gridCol w:w="2016"/>
+        <w:gridCol w:w="3830"/>
+        <w:gridCol w:w="4233"/>
+      </w:tblGrid>
+      <w:tr>
+        <w:trPr>
+          <w:tblHeader w:val="true"/>
+          <w:cantSplit w:val="true"/>
+        </w:trPr>
+        <w:tc>
+          <w:tcPr>
+            <w:tcW w:type="dxa" w:w="2016"/>
+            <w:shd w:val="clear" w:color="auto" w:fill="111111"/>
+            <w:tcMar>
+              <w:top w:type="dxa" w:w="90"/>
+              <w:left w:type="dxa" w:w="110"/>
+              <w:bottom w:type="dxa" w:w="90"/>
+              <w:right w:type="dxa" w:w="110"/>
+            </w:tcMar>
+          </w:tcPr>
+          <w:p>
+            <w:pPr>
+              <w:keepNext/>
+              <w:spacing w:before="20" w:after="20"/>
+              <w:spacing w:line="264" w:lineRule="auto"/>
+            </w:pPr>
+            <w:r>
+              <w:rPr>
+                <w:rFonts w:ascii="Arial" w:hAnsi="Arial" w:eastAsia="Arial"/>
+                <w:b/>
+                <w:caps/>
+                <w:color w:val="FFFFFF"/>
+                <w:sz w:val="17"/>
+                <w:spacing w:val="16"/>
+              </w:rPr>
+            </w:r>
+          </w:p>
+        </w:tc>
+        <w:tc>
+          <w:tcPr>
+            <w:tcW w:type="dxa" w:w="3830"/>
+            <w:shd w:val="clear" w:color="auto" w:fill="111111"/>
+            <w:tcMar>
+              <w:top w:type="dxa" w:w="90"/>
+              <w:left w:type="dxa" w:w="110"/>
+              <w:bottom w:type="dxa" w:w="90"/>
+              <w:right w:type="dxa" w:w="110"/>
+            </w:tcMar>
+          </w:tcPr>
+          <w:p>
+            <w:pPr>
+              <w:keepNext/>
+              <w:spacing w:before="20" w:after="20"/>
+              <w:spacing w:line="264" w:lineRule="auto"/>
+            </w:pPr>
+            <w:r>
+              <w:rPr>
+                <w:rFonts w:ascii="Arial" w:hAnsi="Arial" w:eastAsia="Arial"/>
+                <w:b/>
+                <w:caps/>
+                <w:color w:val="FFFFFF"/>
+                <w:sz w:val="17"/>
+                <w:spacing w:val="16"/>
+              </w:rPr>
+              <w:t>On the LumiLink stack</w:t>
+            </w:r>
+          </w:p>
+        </w:tc>
+        <w:tc>
+          <w:tcPr>
+            <w:tcW w:type="dxa" w:w="4233"/>
+            <w:shd w:val="clear" w:color="auto" w:fill="111111"/>
+            <w:tcMar>
+              <w:top w:type="dxa" w:w="90"/>
+              <w:left w:type="dxa" w:w="110"/>
+              <w:bottom w:type="dxa" w:w="90"/>
+              <w:right w:type="dxa" w:w="110"/>
+            </w:tcMar>
+          </w:tcPr>
+          <w:p>
+            <w:pPr>
+              <w:keepNext/>
+              <w:spacing w:before="20" w:after="20"/>
+              <w:spacing w:line="264" w:lineRule="auto"/>
+            </w:pPr>
+            <w:r>
+              <w:rPr>
+                <w:rFonts w:ascii="Arial" w:hAnsi="Arial" w:eastAsia="Arial"/>
+                <w:b/>
+                <w:caps/>
+                <w:color w:val="FFFFFF"/>
+                <w:sz w:val="17"/>
+                <w:spacing w:val="16"/>
+              </w:rPr>
+              <w:t>Built in-house at PACKS</w:t>
+            </w:r>
+          </w:p>
+        </w:tc>
+      </w:tr>
+      <w:tr>
+        <w:trPr>
+          <w:cantSplit w:val="true"/>
+        </w:trPr>
+        <w:tc>
+          <w:tcPr>
+            <w:tcW w:type="dxa" w:w="2016"/>
+            <w:tcMar>
+              <w:top w:type="dxa" w:w="90"/>
+              <w:left w:type="dxa" w:w="110"/>
+              <w:bottom w:type="dxa" w:w="90"/>
+              <w:right w:type="dxa" w:w="110"/>
+            </w:tcMar>
+          </w:tcPr>
+          <w:p>
+            <w:pPr>
+              <w:keepNext/>
+              <w:spacing w:before="20" w:after="20"/>
+              <w:spacing w:line="264" w:lineRule="auto"/>
+            </w:pPr>
+            <w:r>
+              <w:rPr>
+                <w:rFonts w:ascii="Arial" w:hAnsi="Arial" w:eastAsia="Arial"/>
+                <w:b w:val="0"/>
+                <w:caps w:val="0"/>
+                <w:color w:val="111111"/>
+                <w:sz w:val="17"/>
+              </w:rPr>
+              <w:t>Build hours for PACKS</w:t>
+            </w:r>
+          </w:p>
+        </w:tc>
+        <w:tc>
+          <w:tcPr>
+            <w:tcW w:type="dxa" w:w="3830"/>
+            <w:tcMar>
+              <w:top w:type="dxa" w:w="90"/>
+              <w:left w:type="dxa" w:w="110"/>
+              <w:bottom w:type="dxa" w:w="90"/>
+              <w:right w:type="dxa" w:w="110"/>
+            </w:tcMar>
+          </w:tcPr>
+          <w:p>
+            <w:pPr>
+              <w:keepNext/>
+              <w:spacing w:before="20" w:after="20"/>
+              <w:spacing w:line="264" w:lineRule="auto"/>
+            </w:pPr>
+            <w:r>
+              <w:rPr>
+                <w:rFonts w:ascii="Arial" w:hAnsi="Arial" w:eastAsia="Arial"/>
+                <w:b w:val="0"/>
+                <w:caps w:val="0"/>
+                <w:color w:val="111111"/>
+                <w:sz w:val="17"/>
+              </w:rPr>
+              <w:t>8-14, after the add-on ships</w:t>
+            </w:r>
+          </w:p>
+        </w:tc>
+        <w:tc>
+          <w:tcPr>
+            <w:tcW w:type="dxa" w:w="4233"/>
+            <w:tcMar>
+              <w:top w:type="dxa" w:w="90"/>
+              <w:left w:type="dxa" w:w="110"/>
+              <w:bottom w:type="dxa" w:w="90"/>
+              <w:right w:type="dxa" w:w="110"/>
+            </w:tcMar>
+          </w:tcPr>
+          <w:p>
+            <w:pPr>
+              <w:keepNext/>
+              <w:spacing w:before="20" w:after="20"/>
+              <w:spacing w:line="264" w:lineRule="auto"/>
+            </w:pPr>
+            <w:r>
+              <w:rPr>
+                <w:rFonts w:ascii="Arial" w:hAnsi="Arial" w:eastAsia="Arial"/>
+                <w:b w:val="0"/>
+                <w:caps w:val="0"/>
+                <w:color w:val="111111"/>
+                <w:sz w:val="17"/>
+              </w:rPr>
+              <w:t>45-65; rebuilds knowledge base, product sync, logging</w:t>
+            </w:r>
+          </w:p>
+        </w:tc>
+      </w:tr>
+      <w:tr>
+        <w:trPr>
+          <w:cantSplit w:val="true"/>
+        </w:trPr>
+        <w:tc>
+          <w:tcPr>
+            <w:tcW w:type="dxa" w:w="2016"/>
+            <w:shd w:val="clear" w:color="auto" w:fill="F2F2F2"/>
+            <w:tcMar>
+              <w:top w:type="dxa" w:w="90"/>
+              <w:left w:type="dxa" w:w="110"/>
+              <w:bottom w:type="dxa" w:w="90"/>
+              <w:right w:type="dxa" w:w="110"/>
+            </w:tcMar>
+          </w:tcPr>
+          <w:p>
+            <w:pPr>
+              <w:keepNext/>
+              <w:spacing w:before="20" w:after="20"/>
+              <w:spacing w:line="264" w:lineRule="auto"/>
+            </w:pPr>
+            <w:r>
+              <w:rPr>
+                <w:rFonts w:ascii="Arial" w:hAnsi="Arial" w:eastAsia="Arial"/>
+                <w:b w:val="0"/>
+                <w:caps w:val="0"/>
+                <w:color w:val="111111"/>
+                <w:sz w:val="17"/>
+              </w:rPr>
+              <w:t>Monthly upkeep</w:t>
+            </w:r>
+          </w:p>
+        </w:tc>
+        <w:tc>
+          <w:tcPr>
+            <w:tcW w:type="dxa" w:w="3830"/>
+            <w:shd w:val="clear" w:color="auto" w:fill="F2F2F2"/>
+            <w:tcMar>
+              <w:top w:type="dxa" w:w="90"/>
+              <w:left w:type="dxa" w:w="110"/>
+              <w:bottom w:type="dxa" w:w="90"/>
+              <w:right w:type="dxa" w:w="110"/>
+            </w:tcMar>
+          </w:tcPr>
+          <w:p>
+            <w:pPr>
+              <w:keepNext/>
+              <w:spacing w:before="20" w:after="20"/>
+              <w:spacing w:line="264" w:lineRule="auto"/>
+            </w:pPr>
+            <w:r>
+              <w:rPr>
+                <w:rFonts w:ascii="Arial" w:hAnsi="Arial" w:eastAsia="Arial"/>
+                <w:b w:val="0"/>
+                <w:caps w:val="0"/>
+                <w:color w:val="111111"/>
+                <w:sz w:val="17"/>
+              </w:rPr>
+              <w:t>1-2 hrs PACKS-specific; platform upkeep shared</w:t>
+            </w:r>
+          </w:p>
+        </w:tc>
+        <w:tc>
+          <w:tcPr>
+            <w:tcW w:type="dxa" w:w="4233"/>
+            <w:shd w:val="clear" w:color="auto" w:fill="F2F2F2"/>
+            <w:tcMar>
+              <w:top w:type="dxa" w:w="90"/>
+              <w:left w:type="dxa" w:w="110"/>
+              <w:bottom w:type="dxa" w:w="90"/>
+              <w:right w:type="dxa" w:w="110"/>
+            </w:tcMar>
+          </w:tcPr>
+          <w:p>
+            <w:pPr>
+              <w:keepNext/>
+              <w:spacing w:before="20" w:after="20"/>
+              <w:spacing w:line="264" w:lineRule="auto"/>
+            </w:pPr>
+            <w:r>
+              <w:rPr>
+                <w:rFonts w:ascii="Arial" w:hAnsi="Arial" w:eastAsia="Arial"/>
+                <w:b w:val="0"/>
+                <w:caps w:val="0"/>
+                <w:color w:val="111111"/>
+                <w:sz w:val="17"/>
+              </w:rPr>
+              <w:t>4-8 hrs, carried alone</w:t>
+            </w:r>
+          </w:p>
+        </w:tc>
+      </w:tr>
+      <w:tr>
+        <w:trPr>
+          <w:cantSplit w:val="true"/>
+        </w:trPr>
+        <w:tc>
+          <w:tcPr>
+            <w:tcW w:type="dxa" w:w="2016"/>
+            <w:tcMar>
+              <w:top w:type="dxa" w:w="90"/>
+              <w:left w:type="dxa" w:w="110"/>
+              <w:bottom w:type="dxa" w:w="90"/>
+              <w:right w:type="dxa" w:w="110"/>
+            </w:tcMar>
+          </w:tcPr>
+          <w:p>
+            <w:pPr>
+              <w:keepNext/>
+              <w:spacing w:before="20" w:after="20"/>
+              <w:spacing w:line="264" w:lineRule="auto"/>
+            </w:pPr>
+            <w:r>
+              <w:rPr>
+                <w:rFonts w:ascii="Arial" w:hAnsi="Arial" w:eastAsia="Arial"/>
+                <w:b w:val="0"/>
+                <w:caps w:val="0"/>
+                <w:color w:val="111111"/>
+                <w:sz w:val="17"/>
+              </w:rPr>
+              <w:t>Vendor or model change</w:t>
+            </w:r>
+          </w:p>
+        </w:tc>
+        <w:tc>
+          <w:tcPr>
+            <w:tcW w:type="dxa" w:w="3830"/>
+            <w:tcMar>
+              <w:top w:type="dxa" w:w="90"/>
+              <w:left w:type="dxa" w:w="110"/>
+              <w:bottom w:type="dxa" w:w="90"/>
+              <w:right w:type="dxa" w:w="110"/>
+            </w:tcMar>
+          </w:tcPr>
+          <w:p>
+            <w:pPr>
+              <w:keepNext/>
+              <w:spacing w:before="20" w:after="20"/>
+              <w:spacing w:line="264" w:lineRule="auto"/>
+            </w:pPr>
+            <w:r>
+              <w:rPr>
+                <w:rFonts w:ascii="Arial" w:hAnsi="Arial" w:eastAsia="Arial"/>
+                <w:b w:val="0"/>
+                <w:caps w:val="0"/>
+                <w:color w:val="111111"/>
+                <w:sz w:val="17"/>
+              </w:rPr>
+              <w:t>LumiLink fixes it once for every client</w:t>
+            </w:r>
+          </w:p>
+        </w:tc>
+        <w:tc>
+          <w:tcPr>
+            <w:tcW w:type="dxa" w:w="4233"/>
+            <w:tcMar>
+              <w:top w:type="dxa" w:w="90"/>
+              <w:left w:type="dxa" w:w="110"/>
+              <w:bottom w:type="dxa" w:w="90"/>
+              <w:right w:type="dxa" w:w="110"/>
+            </w:tcMar>
+          </w:tcPr>
+          <w:p>
+            <w:pPr>
+              <w:keepNext/>
+              <w:spacing w:before="20" w:after="20"/>
+              <w:spacing w:line="264" w:lineRule="auto"/>
+            </w:pPr>
+            <w:r>
+              <w:rPr>
+                <w:rFonts w:ascii="Arial" w:hAnsi="Arial" w:eastAsia="Arial"/>
+                <w:b w:val="0"/>
+                <w:caps w:val="0"/>
+                <w:color w:val="111111"/>
+                <w:sz w:val="17"/>
+              </w:rPr>
+              <w:t>PACKS fixes its own copy</w:t>
+            </w:r>
+          </w:p>
+        </w:tc>
+      </w:tr>
+      <w:tr>
+        <w:trPr>
+          <w:cantSplit w:val="true"/>
+        </w:trPr>
+        <w:tc>
+          <w:tcPr>
+            <w:tcW w:type="dxa" w:w="2016"/>
+            <w:shd w:val="clear" w:color="auto" w:fill="F2F2F2"/>
+            <w:tcMar>
+              <w:top w:type="dxa" w:w="90"/>
+              <w:left w:type="dxa" w:w="110"/>
+              <w:bottom w:type="dxa" w:w="90"/>
+              <w:right w:type="dxa" w:w="110"/>
+            </w:tcMar>
+          </w:tcPr>
+          <w:p>
+            <w:pPr>
+              <w:keepNext/>
+              <w:spacing w:before="20" w:after="20"/>
+              <w:spacing w:line="264" w:lineRule="auto"/>
+            </w:pPr>
+            <w:r>
+              <w:rPr>
+                <w:rFonts w:ascii="Arial" w:hAnsi="Arial" w:eastAsia="Arial"/>
+                <w:b w:val="0"/>
+                <w:caps w:val="0"/>
+                <w:color w:val="111111"/>
+                <w:sz w:val="17"/>
+              </w:rPr>
+              <w:t>Running cost</w:t>
+            </w:r>
+          </w:p>
+        </w:tc>
+        <w:tc>
+          <w:tcPr>
+            <w:tcW w:type="dxa" w:w="3830"/>
+            <w:shd w:val="clear" w:color="auto" w:fill="F2F2F2"/>
+            <w:tcMar>
+              <w:top w:type="dxa" w:w="90"/>
+              <w:left w:type="dxa" w:w="110"/>
+              <w:bottom w:type="dxa" w:w="90"/>
+              <w:right w:type="dxa" w:w="110"/>
+            </w:tcMar>
+          </w:tcPr>
+          <w:p>
+            <w:pPr>
+              <w:keepNext/>
+              <w:spacing w:before="20" w:after="20"/>
+              <w:spacing w:line="264" w:lineRule="auto"/>
+            </w:pPr>
+            <w:r>
+              <w:rPr>
+                <w:rFonts w:ascii="Arial" w:hAnsi="Arial" w:eastAsia="Arial"/>
+                <w:b w:val="0"/>
+                <w:caps w:val="0"/>
+                <w:color w:val="111111"/>
+                <w:sz w:val="17"/>
+              </w:rPr>
+              <w:t>Per-minute usage plus a LumiLink add-on fee</w:t>
+            </w:r>
+          </w:p>
+        </w:tc>
+        <w:tc>
+          <w:tcPr>
+            <w:tcW w:type="dxa" w:w="4233"/>
+            <w:shd w:val="clear" w:color="auto" w:fill="F2F2F2"/>
+            <w:tcMar>
+              <w:top w:type="dxa" w:w="90"/>
+              <w:left w:type="dxa" w:w="110"/>
+              <w:bottom w:type="dxa" w:w="90"/>
+              <w:right w:type="dxa" w:w="110"/>
+            </w:tcMar>
+          </w:tcPr>
+          <w:p>
+            <w:pPr>
+              <w:keepNext/>
+              <w:spacing w:before="20" w:after="20"/>
+              <w:spacing w:line="264" w:lineRule="auto"/>
+            </w:pPr>
+            <w:r>
+              <w:rPr>
+                <w:rFonts w:ascii="Arial" w:hAnsi="Arial" w:eastAsia="Arial"/>
+                <w:b w:val="0"/>
+                <w:caps w:val="0"/>
+                <w:color w:val="111111"/>
+                <w:sz w:val="17"/>
+              </w:rPr>
+              <w:t>Same usage plus its own vendor plans</w:t>
+            </w:r>
+          </w:p>
+        </w:tc>
+      </w:tr>
+      <w:tr>
+        <w:trPr>
+          <w:cantSplit w:val="true"/>
+        </w:trPr>
+        <w:tc>
+          <w:tcPr>
+            <w:tcW w:type="dxa" w:w="2016"/>
+            <w:tcMar>
+              <w:top w:type="dxa" w:w="90"/>
+              <w:left w:type="dxa" w:w="110"/>
+              <w:bottom w:type="dxa" w:w="90"/>
+              <w:right w:type="dxa" w:w="110"/>
+            </w:tcMar>
+          </w:tcPr>
+          <w:p>
+            <w:pPr>
+              <w:keepNext/>
+              <w:spacing w:before="20" w:after="20"/>
+              <w:spacing w:line="264" w:lineRule="auto"/>
+            </w:pPr>
+            <w:r>
+              <w:rPr>
+                <w:rFonts w:ascii="Arial" w:hAnsi="Arial" w:eastAsia="Arial"/>
+                <w:b w:val="0"/>
+                <w:caps w:val="0"/>
+                <w:color w:val="111111"/>
+                <w:sz w:val="17"/>
+              </w:rPr>
+              <w:t>Owner</w:t>
+            </w:r>
+          </w:p>
+        </w:tc>
+        <w:tc>
+          <w:tcPr>
+            <w:tcW w:type="dxa" w:w="3830"/>
+            <w:tcMar>
+              <w:top w:type="dxa" w:w="90"/>
+              <w:left w:type="dxa" w:w="110"/>
+              <w:bottom w:type="dxa" w:w="90"/>
+              <w:right w:type="dxa" w:w="110"/>
+            </w:tcMar>
+          </w:tcPr>
+          <w:p>
+            <w:pPr>
+              <w:keepNext/>
+              <w:spacing w:before="20" w:after="20"/>
+              <w:spacing w:line="264" w:lineRule="auto"/>
+            </w:pPr>
+            <w:r>
+              <w:rPr>
+                <w:rFonts w:ascii="Arial" w:hAnsi="Arial" w:eastAsia="Arial"/>
+                <w:b w:val="0"/>
+                <w:caps w:val="0"/>
+                <w:color w:val="111111"/>
+                <w:sz w:val="17"/>
+              </w:rPr>
+              <w:t>LumiLink; PACKS sets persona, look and menu</w:t>
+            </w:r>
+          </w:p>
+        </w:tc>
+        <w:tc>
+          <w:tcPr>
+            <w:tcW w:type="dxa" w:w="4233"/>
+            <w:tcMar>
+              <w:top w:type="dxa" w:w="90"/>
+              <w:left w:type="dxa" w:w="110"/>
+              <w:bottom w:type="dxa" w:w="90"/>
+              <w:right w:type="dxa" w:w="110"/>
+            </w:tcMar>
+          </w:tcPr>
+          <w:p>
+            <w:pPr>
+              <w:keepNext/>
+              <w:spacing w:before="20" w:after="20"/>
+              <w:spacing w:line="264" w:lineRule="auto"/>
+            </w:pPr>
+            <w:r>
+              <w:rPr>
+                <w:rFonts w:ascii="Arial" w:hAnsi="Arial" w:eastAsia="Arial"/>
+                <w:b w:val="0"/>
+                <w:caps w:val="0"/>
+                <w:color w:val="111111"/>
+                <w:sz w:val="17"/>
+              </w:rPr>
+              <w:t>PACKS's developers</w:t>
+            </w:r>
+          </w:p>
+        </w:tc>
+      </w:tr>
+      <w:tr>
+        <w:trPr>
+          <w:cantSplit w:val="true"/>
+        </w:trPr>
+        <w:tc>
+          <w:tcPr>
+            <w:tcW w:type="dxa" w:w="2016"/>
+            <w:shd w:val="clear" w:color="auto" w:fill="F2F2F2"/>
+            <w:tcMar>
+              <w:top w:type="dxa" w:w="90"/>
+              <w:left w:type="dxa" w:w="110"/>
+              <w:bottom w:type="dxa" w:w="90"/>
+              <w:right w:type="dxa" w:w="110"/>
+            </w:tcMar>
+          </w:tcPr>
+          <w:p>
+            <w:pPr>
+              <w:spacing w:before="20" w:after="20"/>
+              <w:spacing w:line="264" w:lineRule="auto"/>
+            </w:pPr>
+            <w:r>
+              <w:rPr>
+                <w:rFonts w:ascii="Arial" w:hAnsi="Arial" w:eastAsia="Arial"/>
+                <w:b w:val="0"/>
+                <w:caps w:val="0"/>
+                <w:color w:val="111111"/>
+                <w:sz w:val="17"/>
+              </w:rPr>
+              <w:t>Cost of the choice</w:t>
+            </w:r>
+          </w:p>
+        </w:tc>
+        <w:tc>
+          <w:tcPr>
+            <w:tcW w:type="dxa" w:w="3830"/>
+            <w:shd w:val="clear" w:color="auto" w:fill="F2F2F2"/>
+            <w:tcMar>
+              <w:top w:type="dxa" w:w="90"/>
+              <w:left w:type="dxa" w:w="110"/>
+              <w:bottom w:type="dxa" w:w="90"/>
+              <w:right w:type="dxa" w:w="110"/>
+            </w:tcMar>
+          </w:tcPr>
+          <w:p>
+            <w:pPr>
+              <w:spacing w:before="20" w:after="20"/>
+              <w:spacing w:line="264" w:lineRule="auto"/>
+            </w:pPr>
+            <w:r>
+              <w:rPr>
+                <w:rFonts w:ascii="Arial" w:hAnsi="Arial" w:eastAsia="Arial"/>
+                <w:b w:val="0"/>
+                <w:caps w:val="0"/>
+                <w:color w:val="111111"/>
+                <w:sz w:val="17"/>
+              </w:rPr>
+              <w:t>Depends on LumiLink's roadmap and pricing</w:t>
+            </w:r>
+          </w:p>
+        </w:tc>
+        <w:tc>
+          <w:tcPr>
+            <w:tcW w:type="dxa" w:w="4233"/>
+            <w:shd w:val="clear" w:color="auto" w:fill="F2F2F2"/>
+            <w:tcMar>
+              <w:top w:type="dxa" w:w="90"/>
+              <w:left w:type="dxa" w:w="110"/>
+              <w:bottom w:type="dxa" w:w="90"/>
+              <w:right w:type="dxa" w:w="110"/>
+            </w:tcMar>
+          </w:tcPr>
+          <w:p>
+            <w:pPr>
+              <w:spacing w:before="20" w:after="20"/>
+              <w:spacing w:line="264" w:lineRule="auto"/>
+            </w:pPr>
+            <w:r>
+              <w:rPr>
+                <w:rFonts w:ascii="Arial" w:hAnsi="Arial" w:eastAsia="Arial"/>
+                <w:b w:val="0"/>
+                <w:caps w:val="0"/>
+                <w:color w:val="111111"/>
+                <w:sz w:val="17"/>
+              </w:rPr>
+              <w:t>No shared fixes; one client carries all upkeep</w:t>
+            </w:r>
+          </w:p>
+        </w:tc>
+      </w:tr>
+    </w:tbl>
+    <w:p>
+      <w:pPr>
+        <w:spacing w:before="0" w:after="80"/>
+      </w:pPr>
     </w:p>
     <w:p>
       <w:pPr>
@@ -2282,7 +2715,7 @@
           <w:color w:val="111111"/>
           <w:sz w:val="19"/>
         </w:rPr>
-        <w:t>approve the add-on and set its price per month or per minute.</w:t>
+        <w:t>approve the LumiLink route and set the add-on price.</w:t>
       </w:r>
     </w:p>
     <w:p>
@@ -2336,7 +2769,7 @@
           <w:color w:val="111111"/>
           <w:sz w:val="19"/>
         </w:rPr>
-        <w:t>choose the avatar's look and name, and confirm the menu data source now that AIQ is going.</w:t>
+        <w:t>choose the avatar's look and name; confirm the menu data source now that AIQ is going.</w:t>
       </w:r>
     </w:p>
     <w:p>
@@ -2379,7 +2812,7 @@
           <w:color w:val="6A6A6A"/>
           <w:sz w:val="15"/>
         </w:rPr>
-        <w:t>Sources: LumiLink codebase (ElevenLabs widget, kb-ingest, voice-product-lookup); Akapulu avatar price index, LiveAvatar, D-ID docs, Macha ElevenLabs pricing. Accessed October 14, 2026. Avatar prices are published ranges, not quotes; re-check before committing a budget.</w:t>
+        <w:t>Sources: LumiLink codebase and git history; Akapulu avatar price index, LiveAvatar, D-ID docs, Macha ElevenLabs pricing. Accessed October 14, 2026. Avatar prices are published ranges, not quotes; re-check before committing a budget.</w:t>
       </w:r>
     </w:p>
     <w:sectPr>

</xml_diff>

<commit_message>
AI concierge: add PACKS in-house scope, make the comparison like-for-like
Adds docs/PACKS-AI-Budtender-In-House-Scope.docx and its build script:
a 2-page brief plus an appendix (hours by row, stack, upkeep breakdown)
for PACKS building its own stack. 48-69 h, using ElevenLabs' built-in
knowledge base and PACKS's existing Dispense proxy Worker.

The LumiLink brief's comparison now counts the add-on build on the LL
side: 46-68 vs 48-69 in total. Upkeep is shared only once other clients
join. It adds the add-on fee and where customer data lives. The
recommendation is now conditional on LumiLink selling to other clients.
Findings and summary updated to match.

Co-Authored-By: Claude Opus 5.5 <noreply@anthropic.com>
</commit_message>
<xml_diff>
--- a/docs/LumiLink-AI-Concierge-Scope.docx
+++ b/docs/LumiLink-AI-Concierge-Scope.docx
@@ -463,7 +463,7 @@
                 <w:color w:val="111111"/>
                 <w:sz w:val="17"/>
               </w:rPr>
-              <w:t>Build it under LumiLink and launch PACKS as the first client, not as a separate in-house build.</w:t>
+              <w:t>Build under LumiLink if it will be sold to other clients. For PACKS alone, both paths cost about the same.</w:t>
             </w:r>
           </w:p>
         </w:tc>
@@ -2032,7 +2032,7 @@
           <w:color w:val="5A5A5A"/>
           <w:sz w:val="17"/>
         </w:rPr>
-        <w:t>The same budtender for PACKS, built two ways. Upkeep figures are our estimates.</w:t>
+        <w:t>The same budtender, built two ways, assuming one developer builds either. Detail: the PACKS In-House Build scope.</w:t>
       </w:r>
     </w:p>
     <w:tbl>
@@ -2180,7 +2180,7 @@
                 <w:color w:val="111111"/>
                 <w:sz w:val="17"/>
               </w:rPr>
-              <w:t>Build hours for PACKS</w:t>
+              <w:t>Total build hours</w:t>
             </w:r>
           </w:p>
         </w:tc>
@@ -2208,7 +2208,7 @@
                 <w:color w:val="111111"/>
                 <w:sz w:val="17"/>
               </w:rPr>
-              <w:t>8-14, after the add-on ships</w:t>
+              <w:t>46-68: add-on 38-54, PACKS launch 8-14</w:t>
             </w:r>
           </w:p>
         </w:tc>
@@ -2236,7 +2236,7 @@
                 <w:color w:val="111111"/>
                 <w:sz w:val="17"/>
               </w:rPr>
-              <w:t>53-79; rebuilds knowledge base, product sync, logging</w:t>
+              <w:t>48-69</w:t>
             </w:r>
           </w:p>
         </w:tc>
@@ -2299,7 +2299,7 @@
                 <w:color w:val="111111"/>
                 <w:sz w:val="17"/>
               </w:rPr>
-              <w:t>1-2 hrs PACKS-specific; platform upkeep shared</w:t>
+              <w:t>4-8 hrs; shared only once other clients join</w:t>
             </w:r>
           </w:p>
         </w:tc>
@@ -2328,7 +2328,7 @@
                 <w:color w:val="111111"/>
                 <w:sz w:val="17"/>
               </w:rPr>
-              <w:t>4-8 hrs, carried alone</w:t>
+              <w:t>4-8 hrs</w:t>
             </w:r>
           </w:p>
         </w:tc>
@@ -2361,7 +2361,7 @@
                 <w:color w:val="111111"/>
                 <w:sz w:val="17"/>
               </w:rPr>
-              <w:t>Vendor or model change</w:t>
+              <w:t>Running cost</w:t>
             </w:r>
           </w:p>
         </w:tc>
@@ -2389,7 +2389,7 @@
                 <w:color w:val="111111"/>
                 <w:sz w:val="17"/>
               </w:rPr>
-              <w:t>LumiLink fixes it once for every client</w:t>
+              <w:t>Same usage plus a LumiLink add-on fee, not set</w:t>
             </w:r>
           </w:p>
         </w:tc>
@@ -2417,7 +2417,7 @@
                 <w:color w:val="111111"/>
                 <w:sz w:val="17"/>
               </w:rPr>
-              <w:t>PACKS fixes its own copy</w:t>
+              <w:t>Same usage plus about $120-205/month in plans</w:t>
             </w:r>
           </w:p>
         </w:tc>
@@ -2451,7 +2451,7 @@
                 <w:color w:val="111111"/>
                 <w:sz w:val="17"/>
               </w:rPr>
-              <w:t>Running cost</w:t>
+              <w:t>Customer data</w:t>
             </w:r>
           </w:p>
         </w:tc>
@@ -2480,7 +2480,7 @@
                 <w:color w:val="111111"/>
                 <w:sz w:val="17"/>
               </w:rPr>
-              <w:t>Per-minute usage plus a LumiLink add-on fee</w:t>
+              <w:t>PACKS transcripts sit in LumiLink's systems</w:t>
             </w:r>
           </w:p>
         </w:tc>
@@ -2509,7 +2509,7 @@
                 <w:color w:val="111111"/>
                 <w:sz w:val="17"/>
               </w:rPr>
-              <w:t>Same usage plus its own vendor plans</w:t>
+              <w:t>Stays with PACKS</w:t>
             </w:r>
           </w:p>
         </w:tc>
@@ -2598,7 +2598,7 @@
                 <w:color w:val="111111"/>
                 <w:sz w:val="17"/>
               </w:rPr>
-              <w:t>PACKS's one developer or contractors</w:t>
+              <w:t>PACKS's one developer</w:t>
             </w:r>
           </w:p>
         </w:tc>
@@ -2631,7 +2631,7 @@
                 <w:color w:val="111111"/>
                 <w:sz w:val="17"/>
               </w:rPr>
-              <w:t>Cost of the choice</w:t>
+              <w:t>Comes out ahead when</w:t>
             </w:r>
           </w:p>
         </w:tc>
@@ -2659,7 +2659,7 @@
                 <w:color w:val="111111"/>
                 <w:sz w:val="17"/>
               </w:rPr>
-              <w:t>Depends on LumiLink's roadmap and pricing</w:t>
+              <w:t>LumiLink sells it to other clients</w:t>
             </w:r>
           </w:p>
         </w:tc>
@@ -2687,7 +2687,7 @@
                 <w:color w:val="111111"/>
                 <w:sz w:val="17"/>
               </w:rPr>
-              <w:t>One person or paid contractors carry all upkeep</w:t>
+              <w:t>PACKS is the only user</w:t>
             </w:r>
           </w:p>
         </w:tc>
@@ -2742,7 +2742,7 @@
           <w:color w:val="111111"/>
           <w:sz w:val="19"/>
         </w:rPr>
-        <w:t>approve the LumiLink route and set the add-on price.</w:t>
+        <w:t>decide whether LumiLink will sell this to other clients; that decides the path.</w:t>
       </w:r>
     </w:p>
     <w:p>

</xml_diff>

<commit_message>
AI concierge: drop reel references, add example cost, trim PACKS scope
Both docs describe the project in general terms and describe the avatar
as a realistic AI human streamed by an avatar provider. The LumiLink
brief gains an example cost row (1,000 four-minute chats: $720-1,240
plus $99). The PACKS in-house scope drops its appendix and moves the
upkeep breakdown into the body, so it matches the LumiLink brief's
length. Findings and summary updated to match.

Co-Authored-By: Claude Opus 5.5 <noreply@anthropic.com>
</commit_message>
<xml_diff>
--- a/docs/LumiLink-AI-Concierge-Scope.docx
+++ b/docs/LumiLink-AI-Concierge-Scope.docx
@@ -162,7 +162,7 @@
                 <w:color w:val="111111"/>
                 <w:sz w:val="17"/>
               </w:rPr>
-              <w:t>A website avatar like the reel's virtual budtender: trained on the store, guardrailed, with a set personality and a custom look.</w:t>
+              <w:t>A talking AI budtender on the website: trained on the store, guardrailed, a set personality and a realistic custom look.</w:t>
             </w:r>
           </w:p>
         </w:tc>
@@ -223,7 +223,7 @@
                 <w:color w:val="111111"/>
                 <w:sz w:val="17"/>
               </w:rPr>
-              <w:t>A LumiLink add-on: our existing ElevenLabs agent (voice, 30+ languages, knowledge base, product lookup) with a licensed avatar face streamed on the site.</w:t>
+              <w:t>A LumiLink add-on: our existing ElevenLabs agent (voice, 30+ languages, knowledge base, product lookup) shown as a realistic AI human, streamed live by an avatar provider.</w:t>
             </w:r>
           </w:p>
         </w:tc>
@@ -343,7 +343,7 @@
                 <w:color w:val="111111"/>
                 <w:sz w:val="17"/>
               </w:rPr>
-              <w:t>About $0.18-0.31 per conversation minute, plus about $99/month for the avatar vendor.</w:t>
+              <w:t>About $0.18-0.31 per conversation minute, plus about $99/month for the avatar provider.</w:t>
             </w:r>
           </w:p>
         </w:tc>
@@ -402,7 +402,7 @@
                 <w:color w:val="111111"/>
                 <w:sz w:val="17"/>
               </w:rPr>
-              <w:t>Avatar vendor not chosen; custom-avatar fee and streaming rates need quotes.</w:t>
+              <w:t>Avatar provider not chosen; custom-avatar fee and streaming rates need quotes.</w:t>
             </w:r>
           </w:p>
         </w:tc>
@@ -626,7 +626,7 @@
                 <w:color w:val="111111"/>
                 <w:sz w:val="17"/>
               </w:rPr>
-              <w:t>Avatar vendor bake-off (LiveAvatar vs D-ID) and custom avatar creation</w:t>
+              <w:t>Avatar provider bake-off (LiveAvatar vs D-ID) and custom AI human</w:t>
             </w:r>
           </w:p>
         </w:tc>
@@ -1211,7 +1211,7 @@
                 <w:color w:val="111111"/>
                 <w:sz w:val="17"/>
               </w:rPr>
-              <w:t>38-54 (excludes vendor wait and legal review)</w:t>
+              <w:t>38-54 (excludes provider wait and legal review)</w:t>
             </w:r>
           </w:p>
         </w:tc>
@@ -1532,7 +1532,7 @@
                 <w:color w:val="111111"/>
                 <w:sz w:val="17"/>
               </w:rPr>
-              <w:t>Avatar streaming (face only)</w:t>
+              <w:t>Avatar streaming</w:t>
             </w:r>
           </w:p>
         </w:tc>
@@ -1623,7 +1623,7 @@
                 <w:color w:val="111111"/>
                 <w:sz w:val="17"/>
               </w:rPr>
-              <w:t>Avatar vendor plan</w:t>
+              <w:t>Avatar provider plan</w:t>
             </w:r>
           </w:p>
         </w:tc>
@@ -1713,7 +1713,7 @@
                 <w:color w:val="111111"/>
                 <w:sz w:val="17"/>
               </w:rPr>
-              <w:t>Custom avatar creation</w:t>
+              <w:t>Custom AI human</w:t>
             </w:r>
           </w:p>
         </w:tc>
@@ -1771,7 +1771,95 @@
                 <w:color w:val="111111"/>
                 <w:sz w:val="17"/>
               </w:rPr>
-              <w:t>Vendor quote, not yet known</w:t>
+              <w:t>Provider quote, not yet known</w:t>
+            </w:r>
+          </w:p>
+        </w:tc>
+      </w:tr>
+      <w:tr>
+        <w:trPr>
+          <w:cantSplit w:val="true"/>
+        </w:trPr>
+        <w:tc>
+          <w:tcPr>
+            <w:tcW w:type="dxa" w:w="4536"/>
+            <w:tcMar>
+              <w:top w:type="dxa" w:w="90"/>
+              <w:left w:type="dxa" w:w="110"/>
+              <w:bottom w:type="dxa" w:w="90"/>
+              <w:right w:type="dxa" w:w="110"/>
+            </w:tcMar>
+          </w:tcPr>
+          <w:p>
+            <w:pPr>
+              <w:keepNext/>
+              <w:spacing w:before="20" w:after="20"/>
+              <w:spacing w:line="264" w:lineRule="auto"/>
+            </w:pPr>
+            <w:r>
+              <w:rPr>
+                <w:rFonts w:ascii="Arial" w:hAnsi="Arial" w:eastAsia="Arial"/>
+                <w:b w:val="0"/>
+                <w:caps w:val="0"/>
+                <w:color w:val="111111"/>
+                <w:sz w:val="17"/>
+              </w:rPr>
+              <w:t>Total per conversation minute</w:t>
+            </w:r>
+          </w:p>
+        </w:tc>
+        <w:tc>
+          <w:tcPr>
+            <w:tcW w:type="dxa" w:w="1713"/>
+            <w:tcMar>
+              <w:top w:type="dxa" w:w="90"/>
+              <w:left w:type="dxa" w:w="110"/>
+              <w:bottom w:type="dxa" w:w="90"/>
+              <w:right w:type="dxa" w:w="110"/>
+            </w:tcMar>
+          </w:tcPr>
+          <w:p>
+            <w:pPr>
+              <w:keepNext/>
+              <w:spacing w:before="20" w:after="20"/>
+              <w:spacing w:line="264" w:lineRule="auto"/>
+            </w:pPr>
+            <w:r>
+              <w:rPr>
+                <w:rFonts w:ascii="Arial" w:hAnsi="Arial" w:eastAsia="Arial"/>
+                <w:b w:val="0"/>
+                <w:caps w:val="0"/>
+                <w:color w:val="111111"/>
+                <w:sz w:val="17"/>
+              </w:rPr>
+            </w:r>
+          </w:p>
+        </w:tc>
+        <w:tc>
+          <w:tcPr>
+            <w:tcW w:type="dxa" w:w="3830"/>
+            <w:tcMar>
+              <w:top w:type="dxa" w:w="90"/>
+              <w:left w:type="dxa" w:w="110"/>
+              <w:bottom w:type="dxa" w:w="90"/>
+              <w:right w:type="dxa" w:w="110"/>
+            </w:tcMar>
+          </w:tcPr>
+          <w:p>
+            <w:pPr>
+              <w:keepNext/>
+              <w:spacing w:before="20" w:after="20"/>
+              <w:spacing w:line="264" w:lineRule="auto"/>
+            </w:pPr>
+            <w:r>
+              <w:rPr>
+                <w:rFonts w:ascii="Arial" w:hAnsi="Arial" w:eastAsia="Arial"/>
+                <w:b w:val="0"/>
+                <w:caps w:val="0"/>
+                <w:color w:val="111111"/>
+                <w:sz w:val="17"/>
+              </w:rPr>
+              <w:t>$0.18-0.31</w:t>
             </w:r>
           </w:p>
         </w:tc>
@@ -1804,7 +1892,7 @@
                 <w:color w:val="111111"/>
                 <w:sz w:val="17"/>
               </w:rPr>
-              <w:t>Total per conversation minute</w:t>
+              <w:t>Example: 1,000 four-minute chats a month</w:t>
             </w:r>
           </w:p>
         </w:tc>
@@ -1859,7 +1947,7 @@
                 <w:color w:val="111111"/>
                 <w:sz w:val="17"/>
               </w:rPr>
-              <w:t>$0.18-0.31 (a 4-minute chat costs $0.70-1.22)</w:t>
+              <w:t>$720-1,240 plus $99</w:t>
             </w:r>
           </w:p>
         </w:tc>
@@ -2769,7 +2857,7 @@
           <w:color w:val="111111"/>
           <w:sz w:val="19"/>
         </w:rPr>
-        <w:t>run the vendor bake-off and get custom-avatar and streaming quotes.</w:t>
+        <w:t>run the provider bake-off; get custom-avatar and streaming quotes.</w:t>
       </w:r>
     </w:p>
     <w:p>

</xml_diff>